<commit_message>
feat: dong bo goi tap, chuan hoa ma hoi vien QR va cap nhat bao cao kien truc
</commit_message>
<xml_diff>
--- a/USER_MANUAL.docx
+++ b/USER_MANUAL.docx
@@ -217,7 +217,7 @@
           <w:color w:val="1F2937"/>
           <w:sz w:val="21"/>
         </w:rPr>
-        <w:t>Báo cáo Doanh thu 3 chi nhánh, Phân tích Giờ cao điểm Heatmap, Tổng quan sức chứa mặt sàn, Lịch sử hóa đơn.</w:t>
+        <w:t>Báo cáo Doanh thu đa chi nhánh (2 cơ sở), Phân tích Giờ cao điểm Heatmap, Tổng quan sức chứa mặt sàn, Lịch sử hóa đơn.</w:t>
       </w:r>
     </w:p>
     <w:p>
@@ -324,7 +324,7 @@
           <w:color w:val="0D9488"/>
           <w:sz w:val="25"/>
         </w:rPr>
-        <w:t>2.2. Trung Tâm Báo Cáo Doanh Thu 3 Chi Nhánh</w:t>
+        <w:t>2.2. Trung Tâm Báo Cáo Doanh Thu Đa Chi Nhánh (2 Cơ Sở)</w:t>
       </w:r>
     </w:p>
     <w:p>
@@ -384,7 +384,7 @@
           <w:color w:val="1F2937"/>
           <w:sz w:val="21"/>
         </w:rPr>
-        <w:t>Xem doanh thu độc lập của CN01 - Quận 1, CN02 - Tân Bình, CN03 - Quận 7 kèm biểu đồ tỷ trọng phần trăm.</w:t>
+        <w:t>Xem doanh thu độc lập của CN01 - Quận 1 và CN02 - Tân Bình kèm biểu đồ tỷ trọng phần trăm.</w:t>
       </w:r>
     </w:p>
     <w:p>

</xml_diff>